<commit_message>
removed the word botswana from bsc internal
</commit_message>
<xml_diff>
--- a/BCS Internal 3.docx
+++ b/BCS Internal 3.docx
@@ -143,6 +143,7 @@
                                     <w:dataBinding w:prefixMappings="xmlns:ns0='http://purl.org/dc/elements/1.1/' xmlns:ns1='http://schemas.openxmlformats.org/package/2006/metadata/core-properties' " w:xpath="/ns1:coreProperties[1]/ns0:creator[1]" w:storeItemID="{6C3C8BC8-F283-45AE-878A-BAB7291924A1}"/>
                                     <w:text/>
                                   </w:sdtPr>
+                                  <w:sdtEndPr/>
                                   <w:sdtContent>
                                     <w:p>
                                       <w:pPr>
@@ -185,6 +186,7 @@
                                       <w:dataBinding w:prefixMappings="xmlns:ns0='http://schemas.openxmlformats.org/officeDocument/2006/extended-properties' " w:xpath="/ns0:Properties[1]/ns0:Company[1]" w:storeItemID="{6668398D-A668-4E3E-A5EB-62B293D839F1}"/>
                                       <w:text/>
                                     </w:sdtPr>
+                                    <w:sdtEndPr/>
                                     <w:sdtContent>
                                       <w:r>
                                         <w:rPr>
@@ -216,6 +218,7 @@
                                       <w:dataBinding w:prefixMappings="xmlns:ns0='http://schemas.microsoft.com/office/2006/coverPageProps' " w:xpath="/ns0:CoverPageProperties[1]/ns0:CompanyAddress[1]" w:storeItemID="{55AF091B-3C7A-41E3-B477-F2FDAA23CFDA}"/>
                                       <w:text/>
                                     </w:sdtPr>
+                                    <w:sdtEndPr/>
                                     <w:sdtContent>
                                       <w:r>
                                         <w:rPr>
@@ -283,6 +286,7 @@
                                     <w:dataBinding w:prefixMappings="xmlns:ns0='http://purl.org/dc/elements/1.1/' xmlns:ns1='http://schemas.openxmlformats.org/package/2006/metadata/core-properties' " w:xpath="/ns1:coreProperties[1]/ns0:title[1]" w:storeItemID="{6C3C8BC8-F283-45AE-878A-BAB7291924A1}"/>
                                     <w:text/>
                                   </w:sdtPr>
+                                  <w:sdtEndPr/>
                                   <w:sdtContent>
                                     <w:p>
                                       <w:pPr>
@@ -324,6 +328,7 @@
                                     <w:dataBinding w:prefixMappings="xmlns:ns0='http://purl.org/dc/elements/1.1/' xmlns:ns1='http://schemas.openxmlformats.org/package/2006/metadata/core-properties' " w:xpath="/ns1:coreProperties[1]/ns0:subject[1]" w:storeItemID="{6C3C8BC8-F283-45AE-878A-BAB7291924A1}"/>
                                     <w:text/>
                                   </w:sdtPr>
+                                  <w:sdtEndPr/>
                                   <w:sdtContent>
                                     <w:p>
                                       <w:pPr>
@@ -2586,8 +2591,18 @@
           <w:sz w:val="24"/>
           <w:szCs w:val="24"/>
         </w:rPr>
-        <w:t>Republic of Botswana (2024) Data Protection Act, 2024 (Act No. 18 of 2024). Gaborone: Government of Botswana.</w:t>
-      </w:r>
+        <w:t>Republic of Botswana (2024) Data Protection Act, 2024 (Act No. 18 of 2024). G</w:t>
+      </w:r>
+      <w:r>
+        <w:rPr>
+          <w:rFonts w:ascii="Times New Roman" w:hAnsi="Times New Roman" w:cs="Times New Roman"/>
+          <w:sz w:val="24"/>
+          <w:szCs w:val="24"/>
+        </w:rPr>
+        <w:t>aborone: Go</w:t>
+      </w:r>
+      <w:bookmarkStart w:id="0" w:name="_GoBack"/>
+      <w:bookmarkEnd w:id="0"/>
     </w:p>
     <w:sectPr>
       <w:pgSz w:w="11906" w:h="16838"/>

</xml_diff>